<commit_message>
testing committing changes to word document
</commit_message>
<xml_diff>
--- a/Coursework_2 - Word submission template.docx
+++ b/Coursework_2 - Word submission template.docx
@@ -100,7 +100,15 @@
         <w:t xml:space="preserve"> parts to the various sections below.</w:t>
       </w:r>
       <w:r>
-        <w:t xml:space="preserve"> Once complete, add this document to the .git repository and submit it together with your code</w:t>
+        <w:t xml:space="preserve"> Once complete, add this document to </w:t>
+      </w:r>
+      <w:proofErr w:type="gramStart"/>
+      <w:r>
+        <w:t>the .git</w:t>
+      </w:r>
+      <w:proofErr w:type="gramEnd"/>
+      <w:r>
+        <w:t xml:space="preserve"> repository and submit it together with your code</w:t>
       </w:r>
       <w:r>
         <w:t>, text files and</w:t>
@@ -147,7 +155,7 @@
           <w:noProof/>
         </w:rPr>
         <w:drawing>
-          <wp:inline distT="0" distB="0" distL="0" distR="0" wp14:anchorId="03F853CB" wp14:editId="4D33717F">
+          <wp:inline distT="0" distB="0" distL="0" distR="0" wp14:anchorId="03F853CB" wp14:editId="546C8E41">
             <wp:extent cx="6638925" cy="4981575"/>
             <wp:effectExtent l="0" t="0" r="9525" b="9525"/>
             <wp:docPr id="2043712996" name="Picture 1"/>
@@ -197,6 +205,11 @@
       </w:r>
     </w:p>
     <w:p>
+      <w:r>
+        <w:t>Testing git</w:t>
+      </w:r>
+    </w:p>
+    <w:p>
       <w:pPr>
         <w:pStyle w:val="ListParagraph"/>
         <w:numPr>
@@ -206,6 +219,7 @@
         <w:jc w:val="left"/>
       </w:pPr>
       <w:r>
+        <w:lastRenderedPageBreak/>
         <w:t>Include</w:t>
       </w:r>
       <w:r>

</xml_diff>

<commit_message>
Changes to task 1.a and removing test words from submission template
</commit_message>
<xml_diff>
--- a/Coursework_2 - Word submission template.docx
+++ b/Coursework_2 - Word submission template.docx
@@ -100,15 +100,7 @@
         <w:t xml:space="preserve"> parts to the various sections below.</w:t>
       </w:r>
       <w:r>
-        <w:t xml:space="preserve"> Once complete, add this document to </w:t>
-      </w:r>
-      <w:proofErr w:type="gramStart"/>
-      <w:r>
-        <w:t>the .git</w:t>
-      </w:r>
-      <w:proofErr w:type="gramEnd"/>
-      <w:r>
-        <w:t xml:space="preserve"> repository and submit it together with your code</w:t>
+        <w:t xml:space="preserve"> Once complete, add this document to the .git repository and submit it together with your code</w:t>
       </w:r>
       <w:r>
         <w:t>, text files and</w:t>
@@ -155,7 +147,7 @@
           <w:noProof/>
         </w:rPr>
         <w:drawing>
-          <wp:inline distT="0" distB="0" distL="0" distR="0" wp14:anchorId="03F853CB" wp14:editId="546C8E41">
+          <wp:inline distT="0" distB="0" distL="0" distR="0" wp14:anchorId="03F853CB" wp14:editId="5C003D4E">
             <wp:extent cx="6638925" cy="4981575"/>
             <wp:effectExtent l="0" t="0" r="9525" b="9525"/>
             <wp:docPr id="2043712996" name="Picture 1"/>
@@ -205,11 +197,6 @@
       </w:r>
     </w:p>
     <w:p>
-      <w:r>
-        <w:t>Testing git</w:t>
-      </w:r>
-    </w:p>
-    <w:p>
       <w:pPr>
         <w:pStyle w:val="ListParagraph"/>
         <w:numPr>
@@ -219,7 +206,6 @@
         <w:jc w:val="left"/>
       </w:pPr>
       <w:r>
-        <w:lastRenderedPageBreak/>
         <w:t>Include</w:t>
       </w:r>
       <w:r>

</xml_diff>

<commit_message>
Task 1 completed!!! yay!!! ^_^
</commit_message>
<xml_diff>
--- a/Coursework_2 - Word submission template.docx
+++ b/Coursework_2 - Word submission template.docx
@@ -100,7 +100,15 @@
         <w:t xml:space="preserve"> parts to the various sections below.</w:t>
       </w:r>
       <w:r>
-        <w:t xml:space="preserve"> Once complete, add this document to the .git repository and submit it together with your code</w:t>
+        <w:t xml:space="preserve"> Once complete, add this document to </w:t>
+      </w:r>
+      <w:proofErr w:type="gramStart"/>
+      <w:r>
+        <w:t>the .git</w:t>
+      </w:r>
+      <w:proofErr w:type="gramEnd"/>
+      <w:r>
+        <w:t xml:space="preserve"> repository and submit it together with your code</w:t>
       </w:r>
       <w:r>
         <w:t>, text files and</w:t>
@@ -140,6 +148,14 @@
       <w:r>
         <w:t>here.</w:t>
       </w:r>
+      <w:r>
+        <w:rPr>
+          <w:noProof/>
+          <w:sz w:val="44"/>
+          <w:szCs w:val="44"/>
+        </w:rPr>
+        <w:t xml:space="preserve"> </w:t>
+      </w:r>
     </w:p>
     <w:p>
       <w:r>
@@ -147,7 +163,7 @@
           <w:noProof/>
         </w:rPr>
         <w:drawing>
-          <wp:inline distT="0" distB="0" distL="0" distR="0" wp14:anchorId="03F853CB" wp14:editId="5C003D4E">
+          <wp:inline distT="0" distB="0" distL="0" distR="0" wp14:anchorId="03F853CB" wp14:editId="63985C5F">
             <wp:extent cx="6638925" cy="4981575"/>
             <wp:effectExtent l="0" t="0" r="9525" b="9525"/>
             <wp:docPr id="2043712996" name="Picture 1"/>
@@ -226,6 +242,62 @@
         <w:pStyle w:val="ListParagraph"/>
         <w:ind w:left="426"/>
       </w:pPr>
+      <w:r>
+        <w:rPr>
+          <w:noProof/>
+          <w:sz w:val="44"/>
+          <w:szCs w:val="44"/>
+        </w:rPr>
+        <w:lastRenderedPageBreak/>
+        <w:drawing>
+          <wp:inline distT="0" distB="0" distL="0" distR="0" wp14:anchorId="41A0E899" wp14:editId="016C6E17">
+            <wp:extent cx="6638925" cy="4000500"/>
+            <wp:effectExtent l="0" t="0" r="9525" b="0"/>
+            <wp:docPr id="370701385" name="Picture 1" descr="The diagram shows a temperature (ￂﾰC) versus time (s) graph, with temperatures ranging from 22.3 to 22.9 and time intervals from 0 to 600 seconds.&#10;&#10;AI-generated content may be incorrect."/>
+            <wp:cNvGraphicFramePr>
+              <a:graphicFrameLocks xmlns:a="http://schemas.openxmlformats.org/drawingml/2006/main" noChangeAspect="1"/>
+            </wp:cNvGraphicFramePr>
+            <a:graphic xmlns:a="http://schemas.openxmlformats.org/drawingml/2006/main">
+              <a:graphicData uri="http://schemas.openxmlformats.org/drawingml/2006/picture">
+                <pic:pic xmlns:pic="http://schemas.openxmlformats.org/drawingml/2006/picture">
+                  <pic:nvPicPr>
+                    <pic:cNvPr id="370701385" name="Picture 1" descr="The diagram shows a temperature (ￂﾰC) versus time (s) graph, with temperatures ranging from 22.3 to 22.9 and time intervals from 0 to 600 seconds.&#10;&#10;AI-generated content may be incorrect."/>
+                    <pic:cNvPicPr>
+                      <a:picLocks noChangeAspect="1" noChangeArrowheads="1"/>
+                    </pic:cNvPicPr>
+                  </pic:nvPicPr>
+                  <pic:blipFill>
+                    <a:blip r:embed="rId9" cstate="print">
+                      <a:extLst>
+                        <a:ext uri="{28A0092B-C50C-407E-A947-70E740481C1C}">
+                          <a14:useLocalDpi xmlns:a14="http://schemas.microsoft.com/office/drawing/2010/main" val="0"/>
+                        </a:ext>
+                      </a:extLst>
+                    </a:blip>
+                    <a:srcRect/>
+                    <a:stretch>
+                      <a:fillRect/>
+                    </a:stretch>
+                  </pic:blipFill>
+                  <pic:spPr bwMode="auto">
+                    <a:xfrm>
+                      <a:off x="0" y="0"/>
+                      <a:ext cx="6638925" cy="4000500"/>
+                    </a:xfrm>
+                    <a:prstGeom prst="rect">
+                      <a:avLst/>
+                    </a:prstGeom>
+                    <a:noFill/>
+                    <a:ln>
+                      <a:noFill/>
+                    </a:ln>
+                  </pic:spPr>
+                </pic:pic>
+              </a:graphicData>
+            </a:graphic>
+          </wp:inline>
+        </w:drawing>
+      </w:r>
     </w:p>
     <w:p>
       <w:pPr>
@@ -373,6 +445,7 @@
         <w:pStyle w:val="Heading1"/>
       </w:pPr>
       <w:r>
+        <w:lastRenderedPageBreak/>
         <w:t xml:space="preserve">Task 4 </w:t>
       </w:r>
       <w:r>
@@ -407,8 +480,8 @@
       </w:pPr>
     </w:p>
     <w:sectPr>
-      <w:headerReference w:type="default" r:id="rId9"/>
-      <w:headerReference w:type="first" r:id="rId10"/>
+      <w:headerReference w:type="default" r:id="rId10"/>
+      <w:headerReference w:type="first" r:id="rId11"/>
       <w:pgSz w:w="11906" w:h="16838"/>
       <w:pgMar w:top="720" w:right="720" w:bottom="720" w:left="720" w:header="708" w:footer="708" w:gutter="0"/>
       <w:cols w:space="708"/>

</xml_diff>

<commit_message>
deleted unecessary files and added picture of task 2 implementation to submission template
</commit_message>
<xml_diff>
--- a/Coursework_2 - Word submission template.docx
+++ b/Coursework_2 - Word submission template.docx
@@ -163,7 +163,7 @@
           <w:noProof/>
         </w:rPr>
         <w:drawing>
-          <wp:inline distT="0" distB="0" distL="0" distR="0" wp14:anchorId="03F853CB" wp14:editId="63985C5F">
+          <wp:inline distT="0" distB="0" distL="0" distR="0" wp14:anchorId="03F853CB" wp14:editId="439A40FD">
             <wp:extent cx="6638925" cy="4981575"/>
             <wp:effectExtent l="0" t="0" r="9525" b="9525"/>
             <wp:docPr id="2043712996" name="Picture 1"/>
@@ -331,7 +331,64 @@
         <w:t>Include a photograph of the implementation here.</w:t>
       </w:r>
     </w:p>
-    <w:p/>
+    <w:p>
+      <w:r>
+        <w:rPr>
+          <w:noProof/>
+          <w:sz w:val="44"/>
+          <w:szCs w:val="44"/>
+        </w:rPr>
+        <w:lastRenderedPageBreak/>
+        <w:drawing>
+          <wp:inline distT="0" distB="0" distL="0" distR="0" wp14:anchorId="4A6617B1" wp14:editId="43E8588F">
+            <wp:extent cx="6638925" cy="4981575"/>
+            <wp:effectExtent l="0" t="0" r="9525" b="9525"/>
+            <wp:docPr id="2130394092" name="Picture 1" descr="The image shows a breadboard setup with an Arduino, featuring various components like LEDs, resistors, and a microcontroller, connected with wires and a power supply.&#10;&#10;AI-generated content may be incorrect."/>
+            <wp:cNvGraphicFramePr>
+              <a:graphicFrameLocks xmlns:a="http://schemas.openxmlformats.org/drawingml/2006/main" noChangeAspect="1"/>
+            </wp:cNvGraphicFramePr>
+            <a:graphic xmlns:a="http://schemas.openxmlformats.org/drawingml/2006/main">
+              <a:graphicData uri="http://schemas.openxmlformats.org/drawingml/2006/picture">
+                <pic:pic xmlns:pic="http://schemas.openxmlformats.org/drawingml/2006/picture">
+                  <pic:nvPicPr>
+                    <pic:cNvPr id="2130394092" name="Picture 1" descr="The image shows a breadboard setup with an Arduino, featuring various components like LEDs, resistors, and a microcontroller, connected with wires and a power supply.&#10;&#10;AI-generated content may be incorrect."/>
+                    <pic:cNvPicPr>
+                      <a:picLocks noChangeAspect="1" noChangeArrowheads="1"/>
+                    </pic:cNvPicPr>
+                  </pic:nvPicPr>
+                  <pic:blipFill>
+                    <a:blip r:embed="rId10" cstate="print">
+                      <a:extLst>
+                        <a:ext uri="{28A0092B-C50C-407E-A947-70E740481C1C}">
+                          <a14:useLocalDpi xmlns:a14="http://schemas.microsoft.com/office/drawing/2010/main" val="0"/>
+                        </a:ext>
+                      </a:extLst>
+                    </a:blip>
+                    <a:srcRect/>
+                    <a:stretch>
+                      <a:fillRect/>
+                    </a:stretch>
+                  </pic:blipFill>
+                  <pic:spPr bwMode="auto">
+                    <a:xfrm>
+                      <a:off x="0" y="0"/>
+                      <a:ext cx="6638925" cy="4981575"/>
+                    </a:xfrm>
+                    <a:prstGeom prst="rect">
+                      <a:avLst/>
+                    </a:prstGeom>
+                    <a:noFill/>
+                    <a:ln>
+                      <a:noFill/>
+                    </a:ln>
+                  </pic:spPr>
+                </pic:pic>
+              </a:graphicData>
+            </a:graphic>
+          </wp:inline>
+        </w:drawing>
+      </w:r>
+    </w:p>
     <w:p>
       <w:pPr>
         <w:pStyle w:val="ListParagraph"/>
@@ -445,7 +502,6 @@
         <w:pStyle w:val="Heading1"/>
       </w:pPr>
       <w:r>
-        <w:lastRenderedPageBreak/>
         <w:t xml:space="preserve">Task 4 </w:t>
       </w:r>
       <w:r>
@@ -469,6 +525,7 @@
         <w:jc w:val="left"/>
       </w:pPr>
       <w:r>
+        <w:lastRenderedPageBreak/>
         <w:t>Add your reflective statement here.</w:t>
       </w:r>
     </w:p>
@@ -480,8 +537,8 @@
       </w:pPr>
     </w:p>
     <w:sectPr>
-      <w:headerReference w:type="default" r:id="rId10"/>
-      <w:headerReference w:type="first" r:id="rId11"/>
+      <w:headerReference w:type="default" r:id="rId11"/>
+      <w:headerReference w:type="first" r:id="rId12"/>
       <w:pgSz w:w="11906" w:h="16838"/>
       <w:pgMar w:top="720" w:right="720" w:bottom="720" w:left="720" w:header="708" w:footer="708" w:gutter="0"/>
       <w:cols w:space="708"/>

</xml_diff>

<commit_message>
deleted unecessary file, created temperature monitor function, and updated submission template
</commit_message>
<xml_diff>
--- a/Coursework_2 - Word submission template.docx
+++ b/Coursework_2 - Word submission template.docx
@@ -100,15 +100,7 @@
         <w:t xml:space="preserve"> parts to the various sections below.</w:t>
       </w:r>
       <w:r>
-        <w:t xml:space="preserve"> Once complete, add this document to </w:t>
-      </w:r>
-      <w:proofErr w:type="gramStart"/>
-      <w:r>
-        <w:t>the .git</w:t>
-      </w:r>
-      <w:proofErr w:type="gramEnd"/>
-      <w:r>
-        <w:t xml:space="preserve"> repository and submit it together with your code</w:t>
+        <w:t xml:space="preserve"> Once complete, add this document to the .git repository and submit it together with your code</w:t>
       </w:r>
       <w:r>
         <w:t>, text files and</w:t>
@@ -163,7 +155,7 @@
           <w:noProof/>
         </w:rPr>
         <w:drawing>
-          <wp:inline distT="0" distB="0" distL="0" distR="0" wp14:anchorId="03F853CB" wp14:editId="439A40FD">
+          <wp:inline distT="0" distB="0" distL="0" distR="0" wp14:anchorId="03F853CB" wp14:editId="6BA97CAE">
             <wp:extent cx="6638925" cy="4981575"/>
             <wp:effectExtent l="0" t="0" r="9525" b="9525"/>
             <wp:docPr id="2043712996" name="Picture 1"/>
@@ -340,7 +332,7 @@
         </w:rPr>
         <w:lastRenderedPageBreak/>
         <w:drawing>
-          <wp:inline distT="0" distB="0" distL="0" distR="0" wp14:anchorId="4A6617B1" wp14:editId="43E8588F">
+          <wp:inline distT="0" distB="0" distL="0" distR="0" wp14:anchorId="4A6617B1" wp14:editId="5288F846">
             <wp:extent cx="6638925" cy="4981575"/>
             <wp:effectExtent l="0" t="0" r="9525" b="9525"/>
             <wp:docPr id="2130394092" name="Picture 1" descr="The image shows a breadboard setup with an Arduino, featuring various components like LEDs, resistors, and a microcontroller, connected with wires and a power supply.&#10;&#10;AI-generated content may be incorrect."/>
@@ -412,6 +404,60 @@
       <w:pPr>
         <w:jc w:val="left"/>
       </w:pPr>
+      <w:r>
+        <w:rPr>
+          <w:noProof/>
+        </w:rPr>
+        <w:lastRenderedPageBreak/>
+        <w:drawing>
+          <wp:inline distT="0" distB="0" distL="0" distR="0" wp14:anchorId="152A222E" wp14:editId="408CA2F3">
+            <wp:extent cx="6647815" cy="4959350"/>
+            <wp:effectExtent l="0" t="0" r="635" b="0"/>
+            <wp:docPr id="732231215" name="Picture 2"/>
+            <wp:cNvGraphicFramePr>
+              <a:graphicFrameLocks xmlns:a="http://schemas.openxmlformats.org/drawingml/2006/main" noChangeAspect="1"/>
+            </wp:cNvGraphicFramePr>
+            <a:graphic xmlns:a="http://schemas.openxmlformats.org/drawingml/2006/main">
+              <a:graphicData uri="http://schemas.openxmlformats.org/drawingml/2006/picture">
+                <pic:pic xmlns:pic="http://schemas.openxmlformats.org/drawingml/2006/picture">
+                  <pic:nvPicPr>
+                    <pic:cNvPr id="0" name="Picture 2"/>
+                    <pic:cNvPicPr>
+                      <a:picLocks noChangeAspect="1" noChangeArrowheads="1"/>
+                    </pic:cNvPicPr>
+                  </pic:nvPicPr>
+                  <pic:blipFill>
+                    <a:blip r:embed="rId11">
+                      <a:extLst>
+                        <a:ext uri="{28A0092B-C50C-407E-A947-70E740481C1C}">
+                          <a14:useLocalDpi xmlns:a14="http://schemas.microsoft.com/office/drawing/2010/main" val="0"/>
+                        </a:ext>
+                      </a:extLst>
+                    </a:blip>
+                    <a:srcRect/>
+                    <a:stretch>
+                      <a:fillRect/>
+                    </a:stretch>
+                  </pic:blipFill>
+                  <pic:spPr bwMode="auto">
+                    <a:xfrm>
+                      <a:off x="0" y="0"/>
+                      <a:ext cx="6647815" cy="4959350"/>
+                    </a:xfrm>
+                    <a:prstGeom prst="rect">
+                      <a:avLst/>
+                    </a:prstGeom>
+                    <a:noFill/>
+                    <a:ln>
+                      <a:noFill/>
+                    </a:ln>
+                  </pic:spPr>
+                </pic:pic>
+              </a:graphicData>
+            </a:graphic>
+          </wp:inline>
+        </w:drawing>
+      </w:r>
     </w:p>
     <w:p>
       <w:pPr>
@@ -525,7 +571,6 @@
         <w:jc w:val="left"/>
       </w:pPr>
       <w:r>
-        <w:lastRenderedPageBreak/>
         <w:t>Add your reflective statement here.</w:t>
       </w:r>
     </w:p>
@@ -537,8 +582,8 @@
       </w:pPr>
     </w:p>
     <w:sectPr>
-      <w:headerReference w:type="default" r:id="rId11"/>
-      <w:headerReference w:type="first" r:id="rId12"/>
+      <w:headerReference w:type="default" r:id="rId12"/>
+      <w:headerReference w:type="first" r:id="rId13"/>
       <w:pgSz w:w="11906" w:h="16838"/>
       <w:pgMar w:top="720" w:right="720" w:bottom="720" w:left="720" w:header="708" w:footer="708" w:gutter="0"/>
       <w:cols w:space="708"/>

</xml_diff>

<commit_message>
Task 2 completed! Yippeee! :D
</commit_message>
<xml_diff>
--- a/Coursework_2 - Word submission template.docx
+++ b/Coursework_2 - Word submission template.docx
@@ -100,7 +100,15 @@
         <w:t xml:space="preserve"> parts to the various sections below.</w:t>
       </w:r>
       <w:r>
-        <w:t xml:space="preserve"> Once complete, add this document to the .git repository and submit it together with your code</w:t>
+        <w:t xml:space="preserve"> Once complete, add this document to </w:t>
+      </w:r>
+      <w:proofErr w:type="gramStart"/>
+      <w:r>
+        <w:t>the .git</w:t>
+      </w:r>
+      <w:proofErr w:type="gramEnd"/>
+      <w:r>
+        <w:t xml:space="preserve"> repository and submit it together with your code</w:t>
       </w:r>
       <w:r>
         <w:t>, text files and</w:t>
@@ -155,7 +163,7 @@
           <w:noProof/>
         </w:rPr>
         <w:drawing>
-          <wp:inline distT="0" distB="0" distL="0" distR="0" wp14:anchorId="03F853CB" wp14:editId="6BA97CAE">
+          <wp:inline distT="0" distB="0" distL="0" distR="0" wp14:anchorId="03F853CB" wp14:editId="2275E3CF">
             <wp:extent cx="6638925" cy="4981575"/>
             <wp:effectExtent l="0" t="0" r="9525" b="9525"/>
             <wp:docPr id="2043712996" name="Picture 1"/>
@@ -332,7 +340,7 @@
         </w:rPr>
         <w:lastRenderedPageBreak/>
         <w:drawing>
-          <wp:inline distT="0" distB="0" distL="0" distR="0" wp14:anchorId="4A6617B1" wp14:editId="5288F846">
+          <wp:inline distT="0" distB="0" distL="0" distR="0" wp14:anchorId="4A6617B1" wp14:editId="652A4A6B">
             <wp:extent cx="6638925" cy="4981575"/>
             <wp:effectExtent l="0" t="0" r="9525" b="9525"/>
             <wp:docPr id="2130394092" name="Picture 1" descr="The image shows a breadboard setup with an Arduino, featuring various components like LEDs, resistors, and a microcontroller, connected with wires and a power supply.&#10;&#10;AI-generated content may be incorrect."/>
@@ -482,6 +490,44 @@
       <w:pPr>
         <w:jc w:val="left"/>
       </w:pPr>
+      <w:r>
+        <w:lastRenderedPageBreak/>
+        <w:drawing>
+          <wp:inline distT="0" distB="0" distL="0" distR="0" wp14:anchorId="1340360C" wp14:editId="4049AACD">
+            <wp:extent cx="6645910" cy="4365625"/>
+            <wp:effectExtent l="0" t="0" r="2540" b="0"/>
+            <wp:docPr id="7072616" name="Picture 1" descr="The image displays a line graph showing a temperature fluctuation over time, with values ranging from 17ￂﾰC to 100ￂﾰC.&#10;&#10;AI-generated content may be incorrect."/>
+            <wp:cNvGraphicFramePr>
+              <a:graphicFrameLocks xmlns:a="http://schemas.openxmlformats.org/drawingml/2006/main" noChangeAspect="1"/>
+            </wp:cNvGraphicFramePr>
+            <a:graphic xmlns:a="http://schemas.openxmlformats.org/drawingml/2006/main">
+              <a:graphicData uri="http://schemas.openxmlformats.org/drawingml/2006/picture">
+                <pic:pic xmlns:pic="http://schemas.openxmlformats.org/drawingml/2006/picture">
+                  <pic:nvPicPr>
+                    <pic:cNvPr id="7072616" name="Picture 1" descr="The image displays a line graph showing a temperature fluctuation over time, with values ranging from 17ￂﾰC to 100ￂﾰC.&#10;&#10;AI-generated content may be incorrect."/>
+                    <pic:cNvPicPr/>
+                  </pic:nvPicPr>
+                  <pic:blipFill>
+                    <a:blip r:embed="rId12"/>
+                    <a:stretch>
+                      <a:fillRect/>
+                    </a:stretch>
+                  </pic:blipFill>
+                  <pic:spPr>
+                    <a:xfrm>
+                      <a:off x="0" y="0"/>
+                      <a:ext cx="6645910" cy="4365625"/>
+                    </a:xfrm>
+                    <a:prstGeom prst="rect">
+                      <a:avLst/>
+                    </a:prstGeom>
+                  </pic:spPr>
+                </pic:pic>
+              </a:graphicData>
+            </a:graphic>
+          </wp:inline>
+        </w:drawing>
+      </w:r>
     </w:p>
     <w:p>
       <w:pPr>
@@ -501,12 +547,67 @@
         <w:pStyle w:val="ListParagraph"/>
         <w:jc w:val="left"/>
       </w:pPr>
+      <w:r>
+        <w:rPr>
+          <w:noProof/>
+        </w:rPr>
+        <w:lastRenderedPageBreak/>
+        <w:drawing>
+          <wp:inline distT="0" distB="0" distL="0" distR="0" wp14:anchorId="55D8C3C3" wp14:editId="044F961E">
+            <wp:extent cx="6642100" cy="8427720"/>
+            <wp:effectExtent l="0" t="0" r="6350" b="0"/>
+            <wp:docPr id="43376790" name="Picture 1"/>
+            <wp:cNvGraphicFramePr>
+              <a:graphicFrameLocks xmlns:a="http://schemas.openxmlformats.org/drawingml/2006/main" noChangeAspect="1"/>
+            </wp:cNvGraphicFramePr>
+            <a:graphic xmlns:a="http://schemas.openxmlformats.org/drawingml/2006/main">
+              <a:graphicData uri="http://schemas.openxmlformats.org/drawingml/2006/picture">
+                <pic:pic xmlns:pic="http://schemas.openxmlformats.org/drawingml/2006/picture">
+                  <pic:nvPicPr>
+                    <pic:cNvPr id="0" name="Picture 1"/>
+                    <pic:cNvPicPr>
+                      <a:picLocks noChangeAspect="1" noChangeArrowheads="1"/>
+                    </pic:cNvPicPr>
+                  </pic:nvPicPr>
+                  <pic:blipFill>
+                    <a:blip r:embed="rId13">
+                      <a:extLst>
+                        <a:ext uri="{28A0092B-C50C-407E-A947-70E740481C1C}">
+                          <a14:useLocalDpi xmlns:a14="http://schemas.microsoft.com/office/drawing/2010/main" val="0"/>
+                        </a:ext>
+                      </a:extLst>
+                    </a:blip>
+                    <a:srcRect/>
+                    <a:stretch>
+                      <a:fillRect/>
+                    </a:stretch>
+                  </pic:blipFill>
+                  <pic:spPr bwMode="auto">
+                    <a:xfrm>
+                      <a:off x="0" y="0"/>
+                      <a:ext cx="6642100" cy="8427720"/>
+                    </a:xfrm>
+                    <a:prstGeom prst="rect">
+                      <a:avLst/>
+                    </a:prstGeom>
+                    <a:noFill/>
+                    <a:ln>
+                      <a:noFill/>
+                    </a:ln>
+                  </pic:spPr>
+                </pic:pic>
+              </a:graphicData>
+            </a:graphic>
+          </wp:inline>
+        </w:drawing>
+      </w:r>
     </w:p>
     <w:p>
       <w:pPr>
         <w:pStyle w:val="Heading1"/>
       </w:pPr>
       <w:r>
+        <w:lastRenderedPageBreak/>
         <w:t>TASK 3</w:t>
       </w:r>
       <w:r>
@@ -582,8 +683,8 @@
       </w:pPr>
     </w:p>
     <w:sectPr>
-      <w:headerReference w:type="default" r:id="rId12"/>
-      <w:headerReference w:type="first" r:id="rId13"/>
+      <w:headerReference w:type="default" r:id="rId14"/>
+      <w:headerReference w:type="first" r:id="rId15"/>
       <w:pgSz w:w="11906" w:h="16838"/>
       <w:pgMar w:top="720" w:right="720" w:bottom="720" w:left="720" w:header="708" w:footer="708" w:gutter="0"/>
       <w:cols w:space="708"/>

</xml_diff>

<commit_message>
task 3 started, flow chart added to submission template and minor changes to main matlab file
</commit_message>
<xml_diff>
--- a/Coursework_2 - Word submission template.docx
+++ b/Coursework_2 - Word submission template.docx
@@ -100,15 +100,7 @@
         <w:t xml:space="preserve"> parts to the various sections below.</w:t>
       </w:r>
       <w:r>
-        <w:t xml:space="preserve"> Once complete, add this document to </w:t>
-      </w:r>
-      <w:proofErr w:type="gramStart"/>
-      <w:r>
-        <w:t>the .git</w:t>
-      </w:r>
-      <w:proofErr w:type="gramEnd"/>
-      <w:r>
-        <w:t xml:space="preserve"> repository and submit it together with your code</w:t>
+        <w:t xml:space="preserve"> Once complete, add this document to the .git repository and submit it together with your code</w:t>
       </w:r>
       <w:r>
         <w:t>, text files and</w:t>
@@ -163,7 +155,7 @@
           <w:noProof/>
         </w:rPr>
         <w:drawing>
-          <wp:inline distT="0" distB="0" distL="0" distR="0" wp14:anchorId="03F853CB" wp14:editId="2275E3CF">
+          <wp:inline distT="0" distB="0" distL="0" distR="0" wp14:anchorId="03F853CB" wp14:editId="544F2CF1">
             <wp:extent cx="6638925" cy="4981575"/>
             <wp:effectExtent l="0" t="0" r="9525" b="9525"/>
             <wp:docPr id="2043712996" name="Picture 1"/>
@@ -340,7 +332,7 @@
         </w:rPr>
         <w:lastRenderedPageBreak/>
         <w:drawing>
-          <wp:inline distT="0" distB="0" distL="0" distR="0" wp14:anchorId="4A6617B1" wp14:editId="652A4A6B">
+          <wp:inline distT="0" distB="0" distL="0" distR="0" wp14:anchorId="4A6617B1" wp14:editId="5BC29EB3">
             <wp:extent cx="6638925" cy="4981575"/>
             <wp:effectExtent l="0" t="0" r="9525" b="9525"/>
             <wp:docPr id="2130394092" name="Picture 1" descr="The image shows a breadboard setup with an Arduino, featuring various components like LEDs, resistors, and a microcontroller, connected with wires and a power supply.&#10;&#10;AI-generated content may be incorrect."/>
@@ -491,6 +483,9 @@
         <w:jc w:val="left"/>
       </w:pPr>
       <w:r>
+        <w:rPr>
+          <w:noProof/>
+        </w:rPr>
         <w:lastRenderedPageBreak/>
         <w:drawing>
           <wp:inline distT="0" distB="0" distL="0" distR="0" wp14:anchorId="1340360C" wp14:editId="4049AACD">
@@ -643,12 +638,66 @@
         <w:ind w:left="709"/>
         <w:jc w:val="left"/>
       </w:pPr>
+      <w:r>
+        <w:rPr>
+          <w:noProof/>
+        </w:rPr>
+        <w:drawing>
+          <wp:inline distT="0" distB="0" distL="0" distR="0" wp14:anchorId="730AB6A3" wp14:editId="78226D28">
+            <wp:extent cx="1781172" cy="7976667"/>
+            <wp:effectExtent l="0" t="0" r="0" b="5715"/>
+            <wp:docPr id="1865055624" name="Picture 1"/>
+            <wp:cNvGraphicFramePr>
+              <a:graphicFrameLocks xmlns:a="http://schemas.openxmlformats.org/drawingml/2006/main" noChangeAspect="1"/>
+            </wp:cNvGraphicFramePr>
+            <a:graphic xmlns:a="http://schemas.openxmlformats.org/drawingml/2006/main">
+              <a:graphicData uri="http://schemas.openxmlformats.org/drawingml/2006/picture">
+                <pic:pic xmlns:pic="http://schemas.openxmlformats.org/drawingml/2006/picture">
+                  <pic:nvPicPr>
+                    <pic:cNvPr id="0" name="Picture 1"/>
+                    <pic:cNvPicPr>
+                      <a:picLocks noChangeAspect="1" noChangeArrowheads="1"/>
+                    </pic:cNvPicPr>
+                  </pic:nvPicPr>
+                  <pic:blipFill>
+                    <a:blip r:embed="rId14">
+                      <a:extLst>
+                        <a:ext uri="{28A0092B-C50C-407E-A947-70E740481C1C}">
+                          <a14:useLocalDpi xmlns:a14="http://schemas.microsoft.com/office/drawing/2010/main" val="0"/>
+                        </a:ext>
+                      </a:extLst>
+                    </a:blip>
+                    <a:srcRect/>
+                    <a:stretch>
+                      <a:fillRect/>
+                    </a:stretch>
+                  </pic:blipFill>
+                  <pic:spPr bwMode="auto">
+                    <a:xfrm>
+                      <a:off x="0" y="0"/>
+                      <a:ext cx="1787803" cy="8006364"/>
+                    </a:xfrm>
+                    <a:prstGeom prst="rect">
+                      <a:avLst/>
+                    </a:prstGeom>
+                    <a:noFill/>
+                    <a:ln>
+                      <a:noFill/>
+                    </a:ln>
+                  </pic:spPr>
+                </pic:pic>
+              </a:graphicData>
+            </a:graphic>
+          </wp:inline>
+        </w:drawing>
+      </w:r>
     </w:p>
     <w:p>
       <w:pPr>
         <w:pStyle w:val="Heading1"/>
       </w:pPr>
       <w:r>
+        <w:lastRenderedPageBreak/>
         <w:t xml:space="preserve">Task 4 </w:t>
       </w:r>
       <w:r>
@@ -683,8 +732,8 @@
       </w:pPr>
     </w:p>
     <w:sectPr>
-      <w:headerReference w:type="default" r:id="rId14"/>
-      <w:headerReference w:type="first" r:id="rId15"/>
+      <w:headerReference w:type="default" r:id="rId15"/>
+      <w:headerReference w:type="first" r:id="rId16"/>
       <w:pgSz w:w="11906" w:h="16838"/>
       <w:pgMar w:top="720" w:right="720" w:bottom="720" w:left="720" w:header="708" w:footer="708" w:gutter="0"/>
       <w:cols w:space="708"/>

</xml_diff>